<commit_message>
Correct the Seamate dates: 2021 to 2026, not present
That engagement has ended. "Present" now appears exactly once, against the
ProForge work, which is the only current role.

Rebuilt all three formats from cv-data.js. PDF verified: two pages, zero
ligature glyphs, zero em dashes.

Co-Authored-By: Claude Opus 5 <noreply@anthropic.com>
</commit_message>
<xml_diff>
--- a/Frederick-Akam-CV.docx
+++ b/Frederick-Akam-CV.docx
@@ -516,7 +516,7 @@
           <w:sz w:val="20"/>
           <w:szCs w:val="20"/>
         </w:rPr>
-        <w:t xml:space="preserve">2021 – Present</w:t>
+        <w:t xml:space="preserve">2021 – 2026</w:t>
       </w:r>
     </w:p>
     <w:p>
@@ -748,7 +748,7 @@
         </w:rPr>
         <w:t xml:space="preserve">PropInfo </w:t>
       </w:r>
-      <w:hyperlink w:history="1" r:id="rId8mrk4kqnbjhf5m1ryu0fy">
+      <w:hyperlink w:history="1" r:id="rId_lj3lnwdd7uqba69keyuq">
         <w:r>
           <w:rPr>
             <w:rFonts w:ascii="Calibri" w:cs="Calibri" w:eastAsia="Calibri" w:hAnsi="Calibri"/>
@@ -785,7 +785,7 @@
         </w:rPr>
         <w:t xml:space="preserve">ProForge </w:t>
       </w:r>
-      <w:hyperlink w:history="1" r:id="rIdmjrmtrdioay5idrmulxuf">
+      <w:hyperlink w:history="1" r:id="rIdya8mvjoliwre3-th1z0sx">
         <w:r>
           <w:rPr>
             <w:rFonts w:ascii="Calibri" w:cs="Calibri" w:eastAsia="Calibri" w:hAnsi="Calibri"/>
@@ -822,7 +822,7 @@
         </w:rPr>
         <w:t xml:space="preserve">iventicks </w:t>
       </w:r>
-      <w:hyperlink w:history="1" r:id="rIdun3e4q6ar0lrgr2f4bdhy">
+      <w:hyperlink w:history="1" r:id="rIddsb_xn_2rl3o9dctbby-s">
         <w:r>
           <w:rPr>
             <w:rFonts w:ascii="Calibri" w:cs="Calibri" w:eastAsia="Calibri" w:hAnsi="Calibri"/>
@@ -859,7 +859,7 @@
         </w:rPr>
         <w:t xml:space="preserve">Strategic Buys </w:t>
       </w:r>
-      <w:hyperlink w:history="1" r:id="rIdefccezt6z8p3vdqmea-yx">
+      <w:hyperlink w:history="1" r:id="rIdjg3tevg_p6ffgmoe2ql_0">
         <w:r>
           <w:rPr>
             <w:rFonts w:ascii="Calibri" w:cs="Calibri" w:eastAsia="Calibri" w:hAnsi="Calibri"/>
@@ -896,7 +896,7 @@
         </w:rPr>
         <w:t xml:space="preserve">Asprey Lawyers </w:t>
       </w:r>
-      <w:hyperlink w:history="1" r:id="rId-2ta3sal72bd_ucmz_lmu">
+      <w:hyperlink w:history="1" r:id="rIdtfcqgprumhbqww1jode8p">
         <w:r>
           <w:rPr>
             <w:rFonts w:ascii="Calibri" w:cs="Calibri" w:eastAsia="Calibri" w:hAnsi="Calibri"/>
@@ -933,7 +933,7 @@
         </w:rPr>
         <w:t xml:space="preserve">Nikunj </w:t>
       </w:r>
-      <w:hyperlink w:history="1" r:id="rIduvjfii1eawnls8i0xuaxk">
+      <w:hyperlink w:history="1" r:id="rId2tzot6utfjdkubqaksnkm">
         <w:r>
           <w:rPr>
             <w:rFonts w:ascii="Calibri" w:cs="Calibri" w:eastAsia="Calibri" w:hAnsi="Calibri"/>
@@ -970,7 +970,7 @@
         </w:rPr>
         <w:t xml:space="preserve">NVRGVP </w:t>
       </w:r>
-      <w:hyperlink w:history="1" r:id="rIdkrl3wu-raxuskd-mjxrjz">
+      <w:hyperlink w:history="1" r:id="rIdu1agqm8kn9iijksaivpbm">
         <w:r>
           <w:rPr>
             <w:rFonts w:ascii="Calibri" w:cs="Calibri" w:eastAsia="Calibri" w:hAnsi="Calibri"/>

</xml_diff>

<commit_message>
Stop presenting ProForge as employment
ProForge is a product Frederick built, not a job he holds. Listing it under
Professional Experience claimed an employer relationship that does not exist,
which is exactly the kind of thing that comes apart when an interviewer asks
who the manager was.

Current entry is now Independent Software Engineer, Lagos, remote, 2024 to
present, with the platforms described as work delivered rather than a role
held. ProForge, PropInfo and the rest remain under Selected Projects with
live URLs, so the evidence is unchanged and nothing is overstated.

Also corrects the portfolio record, which still showed Seamate as current.

Co-Authored-By: Claude Opus 5 <noreply@anthropic.com>
</commit_message>
<xml_diff>
--- a/Frederick-Akam-CV.docx
+++ b/Frederick-Akam-CV.docx
@@ -355,16 +355,16 @@
           <w:sz w:val="22"/>
           <w:szCs w:val="22"/>
         </w:rPr>
-        <w:t xml:space="preserve">Developer</w:t>
-      </w:r>
-      <w:r>
-        <w:rPr>
-          <w:rFonts w:ascii="Calibri" w:cs="Calibri" w:eastAsia="Calibri" w:hAnsi="Calibri"/>
-          <w:color w:val="1A1A1A"/>
-          <w:sz w:val="21"/>
-          <w:szCs w:val="21"/>
-        </w:rPr>
-        <w:t xml:space="preserve">  |  ProForge, Melbourne, Australia (Remote)</w:t>
+        <w:t xml:space="preserve">Independent Software Engineer</w:t>
+      </w:r>
+      <w:r>
+        <w:rPr>
+          <w:rFonts w:ascii="Calibri" w:cs="Calibri" w:eastAsia="Calibri" w:hAnsi="Calibri"/>
+          <w:color w:val="1A1A1A"/>
+          <w:sz w:val="21"/>
+          <w:szCs w:val="21"/>
+        </w:rPr>
+        <w:t xml:space="preserve">  |  Lagos, Nigeria (Remote)</w:t>
       </w:r>
     </w:p>
     <w:p>
@@ -399,7 +399,7 @@
           <w:sz w:val="21"/>
           <w:szCs w:val="21"/>
         </w:rPr>
-        <w:t xml:space="preserve">Built ProForge, an AI receptionist for Australian trade businesses: voice AI answers calls around the clock, books jobs directly into calendars, sends SMS confirmations, follows up quotes, requests reviews and routes genuine emergencies to the operator. Sole developer across voice, telephony, backend and interface.</w:t>
+        <w:t xml:space="preserve">Build and ship production web platforms end to end for Australian businesses: database schema, backend, API, interface, deployment and the operational tooling around them.</w:t>
       </w:r>
     </w:p>
     <w:p>
@@ -418,7 +418,7 @@
           <w:sz w:val="21"/>
           <w:szCs w:val="21"/>
         </w:rPr>
-        <w:t xml:space="preserve">Built PropInfo, a multi-tenant SaaS platform for Australian buyer's agents. Uses the Claude API to generate pre-purchase property assessments against comparable sales, and computes state-specific stamp duty and lenders mortgage insurance, thirty-year investment projections, rental yield and depreciation.</w:t>
+        <w:t xml:space="preserve">Built PropInfo, a multi-tenant SaaS platform for buyer's agents. Uses the Claude API to generate pre-purchase property assessments against comparable sales, and computes state-specific stamp duty and lenders mortgage insurance, thirty-year investment projections, rental yield and depreciation.</w:t>
       </w:r>
     </w:p>
     <w:p>
@@ -456,7 +456,7 @@
           <w:sz w:val="21"/>
           <w:szCs w:val="21"/>
         </w:rPr>
-        <w:t xml:space="preserve">Delivered client web platforms end to end, including a six-language law firm site and a CMS-driven sponsorship platform where the client edits all content without a developer.</w:t>
+        <w:t xml:space="preserve">Built ProForge, an AI receptionist for trade businesses: voice AI answers calls around the clock, books jobs directly into calendars, sends SMS confirmations, follows up quotes and routes genuine emergencies to the operator. Sole developer across voice, telephony, backend and interface.</w:t>
       </w:r>
     </w:p>
     <w:p>
@@ -475,6 +475,25 @@
           <w:sz w:val="21"/>
           <w:szCs w:val="21"/>
         </w:rPr>
+        <w:t xml:space="preserve">Delivered client web platforms end to end, including a six-language law firm site and a CMS-driven sponsorship platform where the client edits all content without a developer.</w:t>
+      </w:r>
+    </w:p>
+    <w:p>
+      <w:pPr>
+        <w:pStyle w:val="ListParagraph"/>
+        <w:numPr>
+          <w:ilvl w:val="0"/>
+          <w:numId w:val="1"/>
+        </w:numPr>
+        <w:spacing w:after="60" w:before="0"/>
+      </w:pPr>
+      <w:r>
+        <w:rPr>
+          <w:rFonts w:ascii="Calibri" w:cs="Calibri" w:eastAsia="Calibri" w:hAnsi="Calibri"/>
+          <w:color w:val="1A1A1A"/>
+          <w:sz w:val="21"/>
+          <w:szCs w:val="21"/>
+        </w:rPr>
         <w:t xml:space="preserve">Engineered a six-scene scroll-scrubbed film homepage with frame-locked scene transitions, separate mobile encodes and server-rendered markup, so all content is present before JavaScript executes.</w:t>
       </w:r>
     </w:p>
@@ -554,7 +573,7 @@
           <w:sz w:val="21"/>
           <w:szCs w:val="21"/>
         </w:rPr>
-        <w:t xml:space="preserve">Conduct code reviews, diagnose and resolve defects, and improve application stability.</w:t>
+        <w:t xml:space="preserve">Conducted code reviews, diagnosed and resolved defects, and improved application stability.</w:t>
       </w:r>
     </w:p>
     <w:p>
@@ -573,7 +592,7 @@
           <w:sz w:val="21"/>
           <w:szCs w:val="21"/>
         </w:rPr>
-        <w:t xml:space="preserve">Develop features in collaboration with company executives and provide direct technical support to end users.</w:t>
+        <w:t xml:space="preserve">Developed features in collaboration with company executives and provided direct technical support to end users.</w:t>
       </w:r>
     </w:p>
     <w:p>
@@ -748,7 +767,7 @@
         </w:rPr>
         <w:t xml:space="preserve">PropInfo </w:t>
       </w:r>
-      <w:hyperlink w:history="1" r:id="rId_lj3lnwdd7uqba69keyuq">
+      <w:hyperlink w:history="1" r:id="rIdvrpd8oxerhyduyme0lorb">
         <w:r>
           <w:rPr>
             <w:rFonts w:ascii="Calibri" w:cs="Calibri" w:eastAsia="Calibri" w:hAnsi="Calibri"/>
@@ -785,7 +804,7 @@
         </w:rPr>
         <w:t xml:space="preserve">ProForge </w:t>
       </w:r>
-      <w:hyperlink w:history="1" r:id="rIdya8mvjoliwre3-th1z0sx">
+      <w:hyperlink w:history="1" r:id="rIdnu2hrimjplyphwrjqrbb2">
         <w:r>
           <w:rPr>
             <w:rFonts w:ascii="Calibri" w:cs="Calibri" w:eastAsia="Calibri" w:hAnsi="Calibri"/>
@@ -822,7 +841,7 @@
         </w:rPr>
         <w:t xml:space="preserve">iventicks </w:t>
       </w:r>
-      <w:hyperlink w:history="1" r:id="rIddsb_xn_2rl3o9dctbby-s">
+      <w:hyperlink w:history="1" r:id="rIdi1v2p8amffp-elcnwam3e">
         <w:r>
           <w:rPr>
             <w:rFonts w:ascii="Calibri" w:cs="Calibri" w:eastAsia="Calibri" w:hAnsi="Calibri"/>
@@ -859,7 +878,7 @@
         </w:rPr>
         <w:t xml:space="preserve">Strategic Buys </w:t>
       </w:r>
-      <w:hyperlink w:history="1" r:id="rIdjg3tevg_p6ffgmoe2ql_0">
+      <w:hyperlink w:history="1" r:id="rIdncf3fukfelshe_uu00-c2">
         <w:r>
           <w:rPr>
             <w:rFonts w:ascii="Calibri" w:cs="Calibri" w:eastAsia="Calibri" w:hAnsi="Calibri"/>
@@ -896,7 +915,7 @@
         </w:rPr>
         <w:t xml:space="preserve">Asprey Lawyers </w:t>
       </w:r>
-      <w:hyperlink w:history="1" r:id="rIdtfcqgprumhbqww1jode8p">
+      <w:hyperlink w:history="1" r:id="rIdkr24zwajk1nlvxqnrotwi">
         <w:r>
           <w:rPr>
             <w:rFonts w:ascii="Calibri" w:cs="Calibri" w:eastAsia="Calibri" w:hAnsi="Calibri"/>
@@ -933,7 +952,7 @@
         </w:rPr>
         <w:t xml:space="preserve">Nikunj </w:t>
       </w:r>
-      <w:hyperlink w:history="1" r:id="rId2tzot6utfjdkubqaksnkm">
+      <w:hyperlink w:history="1" r:id="rIdvwokl7beevnrdf7aitbv1">
         <w:r>
           <w:rPr>
             <w:rFonts w:ascii="Calibri" w:cs="Calibri" w:eastAsia="Calibri" w:hAnsi="Calibri"/>
@@ -970,7 +989,7 @@
         </w:rPr>
         <w:t xml:space="preserve">NVRGVP </w:t>
       </w:r>
-      <w:hyperlink w:history="1" r:id="rIdu1agqm8kn9iijksaivpbm">
+      <w:hyperlink w:history="1" r:id="rIdf9cgcvuk9o3pfsq_7a5dz">
         <w:r>
           <w:rPr>
             <w:rFonts w:ascii="Calibri" w:cs="Calibri" w:eastAsia="Calibri" w:hAnsi="Calibri"/>

</xml_diff>

<commit_message>
Rewrite the Efficacy entry to what the work actually was
The bullets claimed microservices architecture, scalable RESTful API design
and machine learning integration. The real work was building and maintaining
websites for the company and its clients, plus research and consultation.

Web development for five years is perfectly respectable and needs no dressing
up. The overstated version was also the riskier one: it invited an interview
question about work that did not happen.

Co-Authored-By: Claude Opus 5 <noreply@anthropic.com>
</commit_message>
<xml_diff>
--- a/Frederick-Akam-CV.docx
+++ b/Frederick-Akam-CV.docx
@@ -715,7 +715,7 @@
           <w:sz w:val="21"/>
           <w:szCs w:val="21"/>
         </w:rPr>
-        <w:t xml:space="preserve">Developed a cloud-based SaaS product within a team of ten engineers, implementing microservices architecture and designing scalable RESTful APIs.</w:t>
+        <w:t xml:space="preserve">Built and maintained websites for the company and its clients, including a school website.</w:t>
       </w:r>
     </w:p>
     <w:p>
@@ -734,26 +734,7 @@
           <w:sz w:val="21"/>
           <w:szCs w:val="21"/>
         </w:rPr>
-        <w:t xml:space="preserve">Integrated machine learning models to improve data analysis capability, and built automated test suites.</w:t>
-      </w:r>
-    </w:p>
-    <w:p>
-      <w:pPr>
-        <w:pStyle w:val="ListParagraph"/>
-        <w:numPr>
-          <w:ilvl w:val="0"/>
-          <w:numId w:val="1"/>
-        </w:numPr>
-        <w:spacing w:after="60" w:before="0"/>
-      </w:pPr>
-      <w:r>
-        <w:rPr>
-          <w:rFonts w:ascii="Calibri" w:cs="Calibri" w:eastAsia="Calibri" w:hAnsi="Calibri"/>
-          <w:color w:val="1A1A1A"/>
-          <w:sz w:val="21"/>
-          <w:szCs w:val="21"/>
-        </w:rPr>
-        <w:t xml:space="preserve">Resolved critical production incidents and worked with UX designers to improve interface usability.</w:t>
+        <w:t xml:space="preserve">Provided technical research and consultation to support client projects.</w:t>
       </w:r>
     </w:p>
     <w:p>
@@ -792,7 +773,7 @@
         </w:rPr>
         <w:t xml:space="preserve">PropInfo </w:t>
       </w:r>
-      <w:hyperlink w:history="1" r:id="rIdq5rtlnbd50mbm70hrq5r_">
+      <w:hyperlink w:history="1" r:id="rIdvfzhrb7jyvxdzokkil55g">
         <w:r>
           <w:rPr>
             <w:rFonts w:ascii="Calibri" w:cs="Calibri" w:eastAsia="Calibri" w:hAnsi="Calibri"/>
@@ -829,7 +810,7 @@
         </w:rPr>
         <w:t xml:space="preserve">ProForge </w:t>
       </w:r>
-      <w:hyperlink w:history="1" r:id="rIdn_a2z-p2s_wshiginzjwy">
+      <w:hyperlink w:history="1" r:id="rIdp6fe5ki7rxzkb9zuourcw">
         <w:r>
           <w:rPr>
             <w:rFonts w:ascii="Calibri" w:cs="Calibri" w:eastAsia="Calibri" w:hAnsi="Calibri"/>
@@ -866,7 +847,7 @@
         </w:rPr>
         <w:t xml:space="preserve">iventicks </w:t>
       </w:r>
-      <w:hyperlink w:history="1" r:id="rIdiliayg0ahwk3ccopkk1kt">
+      <w:hyperlink w:history="1" r:id="rId9czuf3vqtfti5uyiv7x-t">
         <w:r>
           <w:rPr>
             <w:rFonts w:ascii="Calibri" w:cs="Calibri" w:eastAsia="Calibri" w:hAnsi="Calibri"/>
@@ -903,7 +884,7 @@
         </w:rPr>
         <w:t xml:space="preserve">Strategic Buys </w:t>
       </w:r>
-      <w:hyperlink w:history="1" r:id="rIdh_omm488bmvobpkk5gti2">
+      <w:hyperlink w:history="1" r:id="rId7kgqfgfcites0asemtidu">
         <w:r>
           <w:rPr>
             <w:rFonts w:ascii="Calibri" w:cs="Calibri" w:eastAsia="Calibri" w:hAnsi="Calibri"/>
@@ -940,7 +921,7 @@
         </w:rPr>
         <w:t xml:space="preserve">Asprey Lawyers </w:t>
       </w:r>
-      <w:hyperlink w:history="1" r:id="rIdq7rhioadmljokm8x3k9cm">
+      <w:hyperlink w:history="1" r:id="rIdptkoqa9maxyex4tc_aknl">
         <w:r>
           <w:rPr>
             <w:rFonts w:ascii="Calibri" w:cs="Calibri" w:eastAsia="Calibri" w:hAnsi="Calibri"/>
@@ -977,7 +958,7 @@
         </w:rPr>
         <w:t xml:space="preserve">Nikunj </w:t>
       </w:r>
-      <w:hyperlink w:history="1" r:id="rIdzifasfpsoagcp5izvybmu">
+      <w:hyperlink w:history="1" r:id="rIdiahsyu_fh7cqlpjdjiem0">
         <w:r>
           <w:rPr>
             <w:rFonts w:ascii="Calibri" w:cs="Calibri" w:eastAsia="Calibri" w:hAnsi="Calibri"/>
@@ -1014,7 +995,7 @@
         </w:rPr>
         <w:t xml:space="preserve">NVRGVP </w:t>
       </w:r>
-      <w:hyperlink w:history="1" r:id="rIditcsvnst7dfunzjmlhylk">
+      <w:hyperlink w:history="1" r:id="rIdtkkpikot-gdlnft1frqml">
         <w:r>
           <w:rPr>
             <w:rFonts w:ascii="Calibri" w:cs="Calibri" w:eastAsia="Calibri" w:hAnsi="Calibri"/>

</xml_diff>

<commit_message>
Correct the location: Kaduna, not Lagos
Lagos was inferred from Seamate being headquartered there. Frederick is in
Kaduna, which the diploma and the Efficacy entry already showed.

Changed everywhere the location describes him: CV header, current role,
portfolio eyebrow, record, footer, meta description, PRODUCT.md. Seamate keeps
Lagos, since that is the company's location, not his.

Co-Authored-By: Claude Opus 5 <noreply@anthropic.com>
</commit_message>
<xml_diff>
--- a/Frederick-Akam-CV.docx
+++ b/Frederick-Akam-CV.docx
@@ -50,7 +50,7 @@
           <w:sz w:val="20"/>
           <w:szCs w:val="20"/>
         </w:rPr>
-        <w:t xml:space="preserve">Lagos, Nigeria (UTC+1)  |  Available for remote work worldwide</w:t>
+        <w:t xml:space="preserve">Kaduna, Nigeria (UTC+1)  |  Available for remote work worldwide</w:t>
       </w:r>
     </w:p>
     <w:p>
@@ -389,7 +389,7 @@
           <w:sz w:val="21"/>
           <w:szCs w:val="21"/>
         </w:rPr>
-        <w:t xml:space="preserve">  |  Lagos, Nigeria (Remote)</w:t>
+        <w:t xml:space="preserve">  |  Kaduna, Nigeria (Remote)</w:t>
       </w:r>
     </w:p>
     <w:p>
@@ -773,7 +773,7 @@
         </w:rPr>
         <w:t xml:space="preserve">PropInfo </w:t>
       </w:r>
-      <w:hyperlink w:history="1" r:id="rIdvfzhrb7jyvxdzokkil55g">
+      <w:hyperlink w:history="1" r:id="rIdtbl9w81qp1mzmeb9wykx2">
         <w:r>
           <w:rPr>
             <w:rFonts w:ascii="Calibri" w:cs="Calibri" w:eastAsia="Calibri" w:hAnsi="Calibri"/>
@@ -810,7 +810,7 @@
         </w:rPr>
         <w:t xml:space="preserve">ProForge </w:t>
       </w:r>
-      <w:hyperlink w:history="1" r:id="rIdp6fe5ki7rxzkb9zuourcw">
+      <w:hyperlink w:history="1" r:id="rIdeohkliolegbmsno6els-i">
         <w:r>
           <w:rPr>
             <w:rFonts w:ascii="Calibri" w:cs="Calibri" w:eastAsia="Calibri" w:hAnsi="Calibri"/>
@@ -847,7 +847,7 @@
         </w:rPr>
         <w:t xml:space="preserve">iventicks </w:t>
       </w:r>
-      <w:hyperlink w:history="1" r:id="rId9czuf3vqtfti5uyiv7x-t">
+      <w:hyperlink w:history="1" r:id="rIdjf8zgjnr8v9x8paayulg6">
         <w:r>
           <w:rPr>
             <w:rFonts w:ascii="Calibri" w:cs="Calibri" w:eastAsia="Calibri" w:hAnsi="Calibri"/>
@@ -884,7 +884,7 @@
         </w:rPr>
         <w:t xml:space="preserve">Strategic Buys </w:t>
       </w:r>
-      <w:hyperlink w:history="1" r:id="rId7kgqfgfcites0asemtidu">
+      <w:hyperlink w:history="1" r:id="rIdbkxo7ha_ok3owh5pfwpr6">
         <w:r>
           <w:rPr>
             <w:rFonts w:ascii="Calibri" w:cs="Calibri" w:eastAsia="Calibri" w:hAnsi="Calibri"/>
@@ -921,7 +921,7 @@
         </w:rPr>
         <w:t xml:space="preserve">Asprey Lawyers </w:t>
       </w:r>
-      <w:hyperlink w:history="1" r:id="rIdptkoqa9maxyex4tc_aknl">
+      <w:hyperlink w:history="1" r:id="rIdtlhsamiaaxoeojrhev6mb">
         <w:r>
           <w:rPr>
             <w:rFonts w:ascii="Calibri" w:cs="Calibri" w:eastAsia="Calibri" w:hAnsi="Calibri"/>
@@ -958,7 +958,7 @@
         </w:rPr>
         <w:t xml:space="preserve">Nikunj </w:t>
       </w:r>
-      <w:hyperlink w:history="1" r:id="rIdiahsyu_fh7cqlpjdjiem0">
+      <w:hyperlink w:history="1" r:id="rIdaq_rjg6onpjduen9kj2xf">
         <w:r>
           <w:rPr>
             <w:rFonts w:ascii="Calibri" w:cs="Calibri" w:eastAsia="Calibri" w:hAnsi="Calibri"/>
@@ -995,7 +995,7 @@
         </w:rPr>
         <w:t xml:space="preserve">NVRGVP </w:t>
       </w:r>
-      <w:hyperlink w:history="1" r:id="rIdtkkpikot-gdlnft1frqml">
+      <w:hyperlink w:history="1" r:id="rIdgsovoqv8r4rmshyqs-kfa">
         <w:r>
           <w:rPr>
             <w:rFonts w:ascii="Calibri" w:cs="Calibri" w:eastAsia="Calibri" w:hAnsi="Calibri"/>

</xml_diff>

<commit_message>
CV: reposition as product engineer, name Twilio and Vapi, drop tutorial certifications, state four years
</commit_message>
<xml_diff>
--- a/Frederick-Akam-CV.docx
+++ b/Frederick-Akam-CV.docx
@@ -33,7 +33,7 @@
           <w:sz w:val="22"/>
           <w:szCs w:val="22"/>
         </w:rPr>
-        <w:t xml:space="preserve">AI &amp; Automation Engineer  |  Full-Stack Software Engineer</w:t>
+        <w:t xml:space="preserve">Full-Stack Product Engineer  |  AI and Automation</w:t>
       </w:r>
     </w:p>
     <w:p>
@@ -50,7 +50,7 @@
           <w:sz w:val="20"/>
           <w:szCs w:val="20"/>
         </w:rPr>
-        <w:t xml:space="preserve">Kaduna, Nigeria (UTC+1)  |  Available for remote work worldwide</w:t>
+        <w:t xml:space="preserve">Kaduna, Nigeria (UTC+1)  |  Remote, worldwide</w:t>
       </w:r>
     </w:p>
     <w:p>
@@ -122,7 +122,7 @@
           <w:sz w:val="21"/>
           <w:szCs w:val="21"/>
         </w:rPr>
-        <w:t xml:space="preserve">Software engineer with ten years of professional experience, now building AI-backed products end to end. I work daily with the Claude API and agentic developer tooling: designing prompts, defining tools, wiring large language model calls into production systems, and evaluating output quality. Eight live production systems shipped, most as sole developer, spanning multi-tenant SaaS, voice AI, workflow automation and data-heavy web platforms. Every project below is publicly live and can be opened and inspected.</w:t>
+        <w:t xml:space="preserve">Software engineer with ten years of professional experience, the last four building 0-to-1 production platforms end to end as the sole developer: schema, backend, AI layer, interface, deployment and the operational tooling around them. Eight systems are live and publicly checkable. I put large language models inside production systems rather than beside them. PropInfo generates pre-purchase property assessments with the Claude API and reconciles them against deterministic financial modelling; ProForge answers a trade business's phone with voice AI, qualifies the caller and books the job. All of it delivered asynchronously from UTC+1 for Australian businesses across property, legal, motorsport and trades.</w:t>
       </w:r>
     </w:p>
     <w:p>
@@ -159,16 +159,16 @@
           <w:sz w:val="21"/>
           <w:szCs w:val="21"/>
         </w:rPr>
-        <w:t xml:space="preserve">AI and LLM: </w:t>
-      </w:r>
-      <w:r>
-        <w:rPr>
-          <w:rFonts w:ascii="Calibri" w:cs="Calibri" w:eastAsia="Calibri" w:hAnsi="Calibri"/>
-          <w:color w:val="1A1A1A"/>
-          <w:sz w:val="21"/>
-          <w:szCs w:val="21"/>
-        </w:rPr>
-        <w:t xml:space="preserve">Anthropic Claude API, OpenAI-compatible APIs, prompt design and iteration, tool and function definitions, agentic workflows, model output evaluation, Claude Code, voice AI integration</w:t>
+        <w:t xml:space="preserve">AI and automation: </w:t>
+      </w:r>
+      <w:r>
+        <w:rPr>
+          <w:rFonts w:ascii="Calibri" w:cs="Calibri" w:eastAsia="Calibri" w:hAnsi="Calibri"/>
+          <w:color w:val="1A1A1A"/>
+          <w:sz w:val="21"/>
+          <w:szCs w:val="21"/>
+        </w:rPr>
+        <w:t xml:space="preserve">Anthropic Claude API, Claude Agent SDK, Claude Code, agentic workflows, tool and function definitions, prompt design and iteration, model output evaluation, voice AI integration (Vapi, Twilio), n8n workflow automation</w:t>
       </w:r>
     </w:p>
     <w:p>
@@ -193,7 +193,7 @@
           <w:sz w:val="21"/>
           <w:szCs w:val="21"/>
         </w:rPr>
-        <w:t xml:space="preserve">TypeScript, JavaScript, React, Next.js (App Router), Tailwind CSS, state management, input validation, error and loading states, responsive and accessible interfaces</w:t>
+        <w:t xml:space="preserve">TypeScript, JavaScript, React, Next.js (App Router), Tailwind CSS, Framer Motion, state management, input validation, error and loading states, responsive and accessible interfaces</w:t>
       </w:r>
     </w:p>
     <w:p>
@@ -234,6 +234,31 @@
           <w:sz w:val="21"/>
           <w:szCs w:val="21"/>
         </w:rPr>
+        <w:t xml:space="preserve">Data: </w:t>
+      </w:r>
+      <w:r>
+        <w:rPr>
+          <w:rFonts w:ascii="Calibri" w:cs="Calibri" w:eastAsia="Calibri" w:hAnsi="Calibri"/>
+          <w:color w:val="1A1A1A"/>
+          <w:sz w:val="21"/>
+          <w:szCs w:val="21"/>
+        </w:rPr>
+        <w:t xml:space="preserve">PostgreSQL, Supabase, SQL schema design and migrations, PostGIS, SQLite, Sanity CMS, multi-tenant architecture</w:t>
+      </w:r>
+    </w:p>
+    <w:p>
+      <w:pPr>
+        <w:spacing w:after="70" w:before="0"/>
+      </w:pPr>
+      <w:r>
+        <w:rPr>
+          <w:rFonts w:ascii="Calibri" w:cs="Calibri" w:eastAsia="Calibri" w:hAnsi="Calibri"/>
+          <w:b/>
+          <w:bCs/>
+          <w:color w:val="1A1A1A"/>
+          <w:sz w:val="21"/>
+          <w:szCs w:val="21"/>
+        </w:rPr>
         <w:t xml:space="preserve">Python: </w:t>
       </w:r>
       <w:r>
@@ -243,57 +268,7 @@
           <w:sz w:val="21"/>
           <w:szCs w:val="21"/>
         </w:rPr>
-        <w:t xml:space="preserve">Data processing, API clients, scraping and automation scripts, standalone backend utilities (httpx, Playwright, openpyxl, PyYAML)</w:t>
-      </w:r>
-    </w:p>
-    <w:p>
-      <w:pPr>
-        <w:spacing w:after="70" w:before="0"/>
-      </w:pPr>
-      <w:r>
-        <w:rPr>
-          <w:rFonts w:ascii="Calibri" w:cs="Calibri" w:eastAsia="Calibri" w:hAnsi="Calibri"/>
-          <w:b/>
-          <w:bCs/>
-          <w:color w:val="1A1A1A"/>
-          <w:sz w:val="21"/>
-          <w:szCs w:val="21"/>
-        </w:rPr>
-        <w:t xml:space="preserve">Data: </w:t>
-      </w:r>
-      <w:r>
-        <w:rPr>
-          <w:rFonts w:ascii="Calibri" w:cs="Calibri" w:eastAsia="Calibri" w:hAnsi="Calibri"/>
-          <w:color w:val="1A1A1A"/>
-          <w:sz w:val="21"/>
-          <w:szCs w:val="21"/>
-        </w:rPr>
-        <w:t xml:space="preserve">PostgreSQL, Supabase, SQL schema design and migrations, PostGIS, SQLite, Sanity CMS, multi-tenant architecture</w:t>
-      </w:r>
-    </w:p>
-    <w:p>
-      <w:pPr>
-        <w:spacing w:after="70" w:before="0"/>
-      </w:pPr>
-      <w:r>
-        <w:rPr>
-          <w:rFonts w:ascii="Calibri" w:cs="Calibri" w:eastAsia="Calibri" w:hAnsi="Calibri"/>
-          <w:b/>
-          <w:bCs/>
-          <w:color w:val="1A1A1A"/>
-          <w:sz w:val="21"/>
-          <w:szCs w:val="21"/>
-        </w:rPr>
-        <w:t xml:space="preserve">Automation: </w:t>
-      </w:r>
-      <w:r>
-        <w:rPr>
-          <w:rFonts w:ascii="Calibri" w:cs="Calibri" w:eastAsia="Calibri" w:hAnsi="Calibri"/>
-          <w:color w:val="1A1A1A"/>
-          <w:sz w:val="21"/>
-          <w:szCs w:val="21"/>
-        </w:rPr>
-        <w:t xml:space="preserve">n8n workflow automation, webhook pipelines, scheduled jobs, document extraction, data enrichment, third-party API integration</w:t>
+        <w:t xml:space="preserve">Data processing, ETL pipelines, API clients, scraping and automation scripts (httpx, Playwright, openpyxl, PyYAML)</w:t>
       </w:r>
     </w:p>
     <w:p>
@@ -424,7 +399,7 @@
           <w:sz w:val="21"/>
           <w:szCs w:val="21"/>
         </w:rPr>
-        <w:t xml:space="preserve">Build and ship production web platforms end to end for Australian businesses: database schema, backend, API, interface, deployment and the operational tooling around them.</w:t>
+        <w:t xml:space="preserve">Build and ship production web platforms end to end for Australian businesses: database schema, backend, API, AI layer, interface, deployment and the operational tooling around them.</w:t>
       </w:r>
     </w:p>
     <w:p>
@@ -443,7 +418,7 @@
           <w:sz w:val="21"/>
           <w:szCs w:val="21"/>
         </w:rPr>
-        <w:t xml:space="preserve">Built PropInfo, a multi-tenant SaaS platform for buyer's agents. Uses the Claude API to generate pre-purchase property assessments against comparable sales, and computes state-specific stamp duty and lenders mortgage insurance, thirty-year investment projections, rental yield and depreciation.</w:t>
+        <w:t xml:space="preserve">Built PropInfo, a multi-tenant SaaS platform that collapses a buyer's agent's twenty-tab research workflow into one system. The Claude API generates pre-purchase property assessments against comparable sales, reconciled against deterministic modelling: state-specific stamp duty and lenders mortgage insurance, thirty-year yield, cash flow and depreciation projections.</w:t>
       </w:r>
     </w:p>
     <w:p>
@@ -462,7 +437,7 @@
           <w:sz w:val="21"/>
           <w:szCs w:val="21"/>
         </w:rPr>
-        <w:t xml:space="preserve">Designed the PropInfo data model and access layer: CRM pipeline from enquiry to settlement, live portfolio valuation, and role-based access control across shared multi-agent workspaces.</w:t>
+        <w:t xml:space="preserve">Designed the PropInfo data model and access layer: CRM pipeline from first enquiry to settlement, live portfolio valuation, and role-based access control across shared multi-agent workspaces.</w:t>
       </w:r>
     </w:p>
     <w:p>
@@ -481,7 +456,7 @@
           <w:sz w:val="21"/>
           <w:szCs w:val="21"/>
         </w:rPr>
-        <w:t xml:space="preserve">Built ProForge, an AI receptionist for trade businesses: voice AI answers calls around the clock, books jobs directly into calendars, sends SMS confirmations, follows up quotes and routes genuine emergencies to the operator. Sole developer across voice, telephony, backend and interface.</w:t>
+        <w:t xml:space="preserve">Built ProForge, an AI receptionist that recovers revenue trade businesses lose to unanswered calls. Voice AI answers around the clock, qualifies the caller, books the job into the calendar, sends SMS confirmation, follows up quotes and escalates genuine emergencies to the operator. Twilio carries the numbers and telephony, Vapi handles the speech layer. Sole developer across voice, automation, backend, marketing site and a separate operator dashboard with its own billing and provisioning.</w:t>
       </w:r>
     </w:p>
     <w:p>
@@ -500,7 +475,7 @@
           <w:sz w:val="21"/>
           <w:szCs w:val="21"/>
         </w:rPr>
-        <w:t xml:space="preserve">Built iventicks, an event ticketing platform, across 95 server-side API endpoints: authentication and sessions, registration and guest account claiming, role-based admin access, payments, refunds, bulk event cancellation, organiser payouts, analytics, data export, and a live check-in stream with offline sync.</w:t>
+        <w:t xml:space="preserve">Built iventicks, an event ticketing platform, across 95 server-side API endpoints: authentication and sessions, guest account claiming, role-based admin, payments, refunds, fraud detection on purchase patterns, bulk event cancellation returning money to hundreds of holders at once, organiser payouts, analytics, data export, and a live check-in stream with offline sync.</w:t>
       </w:r>
     </w:p>
     <w:p>
@@ -519,7 +494,7 @@
           <w:sz w:val="21"/>
           <w:szCs w:val="21"/>
         </w:rPr>
-        <w:t xml:space="preserve">Wrote standalone Python tooling for data processing and third-party API clients, including a lead pipeline built on httpx and openpyxl, and a headless accessibility scanner on Playwright.</w:t>
+        <w:t xml:space="preserve">Wrote standalone Python tooling for data processing and third-party API clients, including a lead pipeline on httpx and openpyxl, and a headless accessibility scanner on Playwright.</w:t>
       </w:r>
     </w:p>
     <w:p>
@@ -538,7 +513,7 @@
           <w:sz w:val="21"/>
           <w:szCs w:val="21"/>
         </w:rPr>
-        <w:t xml:space="preserve">Delivered client web platforms end to end, including a six-language law firm site and a CMS-driven sponsorship platform where the client edits all content without a developer.</w:t>
+        <w:t xml:space="preserve">Delivered client web platforms end to end, including a six-language law firm site and a CMS-driven sponsorship platform where the client edits every career fact without a developer.</w:t>
       </w:r>
     </w:p>
     <w:p>
@@ -660,6 +635,25 @@
     </w:p>
     <w:p>
       <w:pPr>
+        <w:pStyle w:val="ListParagraph"/>
+        <w:numPr>
+          <w:ilvl w:val="0"/>
+          <w:numId w:val="1"/>
+        </w:numPr>
+        <w:spacing w:after="60" w:before="0"/>
+      </w:pPr>
+      <w:r>
+        <w:rPr>
+          <w:rFonts w:ascii="Calibri" w:cs="Calibri" w:eastAsia="Calibri" w:hAnsi="Calibri"/>
+          <w:color w:val="1A1A1A"/>
+          <w:sz w:val="21"/>
+          <w:szCs w:val="21"/>
+        </w:rPr>
+        <w:t xml:space="preserve">Independent client work ran alongside this role from 2024.</w:t>
+      </w:r>
+    </w:p>
+    <w:p>
+      <w:pPr>
         <w:spacing w:after="0" w:before="140"/>
       </w:pPr>
       <w:r>
@@ -773,7 +767,7 @@
         </w:rPr>
         <w:t xml:space="preserve">PropInfo </w:t>
       </w:r>
-      <w:hyperlink w:history="1" r:id="rIdtbl9w81qp1mzmeb9wykx2">
+      <w:hyperlink w:history="1" r:id="rIdsbbsg_jqdzvmxzbj-n19n">
         <w:r>
           <w:rPr>
             <w:rFonts w:ascii="Calibri" w:cs="Calibri" w:eastAsia="Calibri" w:hAnsi="Calibri"/>
@@ -792,7 +786,7 @@
           <w:sz w:val="21"/>
           <w:szCs w:val="21"/>
         </w:rPr>
-        <w:t xml:space="preserve"> – Multi-tenant SaaS for Australian buyer's agents. Claude API property assessments, financial modelling, CRM, RBAC. Next.js, TypeScript, Supabase.</w:t>
+        <w:t xml:space="preserve"> – Multi-tenant SaaS for Australian buyer's agents. Claude API property assessments reconciled against deterministic financial modelling, CRM, RBAC. Next.js, TypeScript, Supabase, Postgres.</w:t>
       </w:r>
     </w:p>
     <w:p>
@@ -810,7 +804,7 @@
         </w:rPr>
         <w:t xml:space="preserve">ProForge </w:t>
       </w:r>
-      <w:hyperlink w:history="1" r:id="rIdeohkliolegbmsno6els-i">
+      <w:hyperlink w:history="1" r:id="rIdla8a5mbgn89gmgztoayko">
         <w:r>
           <w:rPr>
             <w:rFonts w:ascii="Calibri" w:cs="Calibri" w:eastAsia="Calibri" w:hAnsi="Calibri"/>
@@ -829,7 +823,7 @@
           <w:sz w:val="21"/>
           <w:szCs w:val="21"/>
         </w:rPr>
-        <w:t xml:space="preserve"> – AI receptionist for trade businesses. Voice AI, telephony, calendar booking, SMS. Next.js, Supabase, n8n.</w:t>
+        <w:t xml:space="preserve"> – AI phone receptionist for trade businesses. Twilio telephony, Vapi voice layer, calendar booking, SMS, quote follow-up. Next.js, TypeScript, Supabase, n8n.</w:t>
       </w:r>
     </w:p>
     <w:p>
@@ -847,7 +841,7 @@
         </w:rPr>
         <w:t xml:space="preserve">iventicks </w:t>
       </w:r>
-      <w:hyperlink w:history="1" r:id="rIdjf8zgjnr8v9x8paayulg6">
+      <w:hyperlink w:history="1" r:id="rId6ehrsdpiuzufg3kei9q-l">
         <w:r>
           <w:rPr>
             <w:rFonts w:ascii="Calibri" w:cs="Calibri" w:eastAsia="Calibri" w:hAnsi="Calibri"/>
@@ -866,7 +860,7 @@
           <w:sz w:val="21"/>
           <w:szCs w:val="21"/>
         </w:rPr>
-        <w:t xml:space="preserve"> – Event ticketing platform. Payments, fraud detection, refunds, payouts, live check-in, PWA.</w:t>
+        <w:t xml:space="preserve"> – Event ticketing across 95 endpoints. Payments, fraud detection, refunds, bulk cancellation, payouts, offline-sync check-in, PWA.</w:t>
       </w:r>
     </w:p>
     <w:p>
@@ -884,7 +878,7 @@
         </w:rPr>
         <w:t xml:space="preserve">Strategic Buys </w:t>
       </w:r>
-      <w:hyperlink w:history="1" r:id="rIdbkxo7ha_ok3owh5pfwpr6">
+      <w:hyperlink w:history="1" r:id="rId1rdnfj_gox1ylyo7_bqb5">
         <w:r>
           <w:rPr>
             <w:rFonts w:ascii="Calibri" w:cs="Calibri" w:eastAsia="Calibri" w:hAnsi="Calibri"/>
@@ -903,7 +897,7 @@
           <w:sz w:val="21"/>
           <w:szCs w:val="21"/>
         </w:rPr>
-        <w:t xml:space="preserve"> – Property advisory site built as a six-scene scroll-scrubbed film, server-rendered.</w:t>
+        <w:t xml:space="preserve"> – Property advisory site built as a six-scene scroll-scrubbed film, frame-locked seams, server-rendered.</w:t>
       </w:r>
     </w:p>
     <w:p>
@@ -921,7 +915,7 @@
         </w:rPr>
         <w:t xml:space="preserve">Asprey Lawyers </w:t>
       </w:r>
-      <w:hyperlink w:history="1" r:id="rIdtlhsamiaaxoeojrhev6mb">
+      <w:hyperlink w:history="1" r:id="rIdher9-sg10nqakhohd2re8">
         <w:r>
           <w:rPr>
             <w:rFonts w:ascii="Calibri" w:cs="Calibri" w:eastAsia="Calibri" w:hAnsi="Calibri"/>
@@ -958,7 +952,7 @@
         </w:rPr>
         <w:t xml:space="preserve">Nikunj </w:t>
       </w:r>
-      <w:hyperlink w:history="1" r:id="rIdaq_rjg6onpjduen9kj2xf">
+      <w:hyperlink w:history="1" r:id="rId3dfjd4papn5y0ux8qtthg">
         <w:r>
           <w:rPr>
             <w:rFonts w:ascii="Calibri" w:cs="Calibri" w:eastAsia="Calibri" w:hAnsi="Calibri"/>
@@ -977,7 +971,7 @@
           <w:sz w:val="21"/>
           <w:szCs w:val="21"/>
         </w:rPr>
-        <w:t xml:space="preserve"> – Sponsorship platform for a racing driver. Sanity CMS, Supabase, GA4.</w:t>
+        <w:t xml:space="preserve"> – Sponsorship platform for a racing driver. Client-editable record via embedded studio. Sanity CMS, Supabase, GA4.</w:t>
       </w:r>
     </w:p>
     <w:p>
@@ -995,7 +989,7 @@
         </w:rPr>
         <w:t xml:space="preserve">NVRGVP </w:t>
       </w:r>
-      <w:hyperlink w:history="1" r:id="rIdgsovoqv8r4rmshyqs-kfa">
+      <w:hyperlink w:history="1" r:id="rIdbjp5vnw48jizqlowb4iq5">
         <w:r>
           <w:rPr>
             <w:rFonts w:ascii="Calibri" w:cs="Calibri" w:eastAsia="Calibri" w:hAnsi="Calibri"/>
@@ -1030,6 +1024,56 @@
           <w:sz w:val="21"/>
           <w:szCs w:val="21"/>
         </w:rPr>
+        <w:t xml:space="preserve">plan-gate  (github.com/Fredons/plan-gate) </w:t>
+      </w:r>
+      <w:r>
+        <w:rPr>
+          <w:rFonts w:ascii="Calibri" w:cs="Calibri" w:eastAsia="Calibri" w:hAnsi="Calibri"/>
+          <w:color w:val="1A1A1A"/>
+          <w:sz w:val="21"/>
+          <w:szCs w:val="21"/>
+        </w:rPr>
+        <w:t xml:space="preserve">– A deterministic gate over AI-generated training plans. The model owns judgement, tested code owns the numbers, and only the code can publish. The README documents where the first version broke: the repair agent was handed a diagnosis instead of the arithmetic, so it trimmed 20% when the maths needed 58%.</w:t>
+      </w:r>
+    </w:p>
+    <w:p>
+      <w:pPr>
+        <w:spacing w:after="80" w:before="0"/>
+      </w:pPr>
+      <w:r>
+        <w:rPr>
+          <w:rFonts w:ascii="Calibri" w:cs="Calibri" w:eastAsia="Calibri" w:hAnsi="Calibri"/>
+          <w:b/>
+          <w:bCs/>
+          <w:color w:val="1A1A1A"/>
+          <w:sz w:val="21"/>
+          <w:szCs w:val="21"/>
+        </w:rPr>
+        <w:t xml:space="preserve">access-audit  (github.com/Fredons/access-audit) </w:t>
+      </w:r>
+      <w:r>
+        <w:rPr>
+          <w:rFonts w:ascii="Calibri" w:cs="Calibri" w:eastAsia="Calibri" w:hAnsi="Calibri"/>
+          <w:color w:val="1A1A1A"/>
+          <w:sz w:val="21"/>
+          <w:szCs w:val="21"/>
+        </w:rPr>
+        <w:t xml:space="preserve">– Headless WCAG 2.1 and 2.2 AA scanner on Playwright and axe-core. Dated, hash-verified evidence records, overlay vendor fingerprinting by script signature, and a re-scan with the overlay blocked to report the delta.</w:t>
+      </w:r>
+    </w:p>
+    <w:p>
+      <w:pPr>
+        <w:spacing w:after="80" w:before="0"/>
+      </w:pPr>
+      <w:r>
+        <w:rPr>
+          <w:rFonts w:ascii="Calibri" w:cs="Calibri" w:eastAsia="Calibri" w:hAnsi="Calibri"/>
+          <w:b/>
+          <w:bCs/>
+          <w:color w:val="1A1A1A"/>
+          <w:sz w:val="21"/>
+          <w:szCs w:val="21"/>
+        </w:rPr>
         <w:t xml:space="preserve">ChargeCore </w:t>
       </w:r>
       <w:r>
@@ -1039,32 +1083,7 @@
           <w:sz w:val="21"/>
           <w:szCs w:val="21"/>
         </w:rPr>
-        <w:t xml:space="preserve">– Charge point management for off-grid solar EV charging on a CitrineOS fork with OCPP. Metering, session billing, tariff logic.</w:t>
-      </w:r>
-    </w:p>
-    <w:p>
-      <w:pPr>
-        <w:spacing w:after="80" w:before="0"/>
-      </w:pPr>
-      <w:r>
-        <w:rPr>
-          <w:rFonts w:ascii="Calibri" w:cs="Calibri" w:eastAsia="Calibri" w:hAnsi="Calibri"/>
-          <w:b/>
-          <w:bCs/>
-          <w:color w:val="1A1A1A"/>
-          <w:sz w:val="21"/>
-          <w:szCs w:val="21"/>
-        </w:rPr>
-        <w:t xml:space="preserve">access-audit </w:t>
-      </w:r>
-      <w:r>
-        <w:rPr>
-          <w:rFonts w:ascii="Calibri" w:cs="Calibri" w:eastAsia="Calibri" w:hAnsi="Calibri"/>
-          <w:color w:val="1A1A1A"/>
-          <w:sz w:val="21"/>
-          <w:szCs w:val="21"/>
-        </w:rPr>
-        <w:t xml:space="preserve">– Headless WCAG 2.2 AA scanner on Playwright and axe-core. Dated, hash-verified evidence records; fingerprints overlay vendors by script signature.</w:t>
+        <w:t xml:space="preserve">– Charge point management for off-grid solar EV charging on a CitrineOS fork with OCPP. Metering, session billing, tariff logic against solar supply.</w:t>
       </w:r>
     </w:p>
     <w:p>
@@ -1188,24 +1207,7 @@
           <w:sz w:val="21"/>
           <w:szCs w:val="21"/>
         </w:rPr>
-        <w:t xml:space="preserve">Certifications and Languages</w:t>
-      </w:r>
-    </w:p>
-    <w:p>
-      <w:pPr>
-        <w:spacing w:after="60" w:before="0"/>
-        <w:jc w:val="left"/>
-      </w:pPr>
-      <w:r>
-        <w:rPr>
-          <w:rFonts w:ascii="Calibri" w:cs="Calibri" w:eastAsia="Calibri" w:hAnsi="Calibri"/>
-          <w:b w:val="false"/>
-          <w:bCs w:val="false"/>
-          <w:color w:val="1A1A1A"/>
-          <w:sz w:val="21"/>
-          <w:szCs w:val="21"/>
-        </w:rPr>
-        <w:t xml:space="preserve">Python (Udemy, 60 Days)  |  Intermediate Python (Codecademy)</w:t>
+        <w:t xml:space="preserve">Languages</w:t>
       </w:r>
     </w:p>
     <w:p>

</xml_diff>

<commit_message>
Add PropInfo data layer (5.88M records, PostGIS ETL) and JARVIS
</commit_message>
<xml_diff>
--- a/Frederick-Akam-CV.docx
+++ b/Frederick-Akam-CV.docx
@@ -243,7 +243,7 @@
           <w:sz w:val="21"/>
           <w:szCs w:val="21"/>
         </w:rPr>
-        <w:t xml:space="preserve">PostgreSQL, Supabase, SQL schema design and migrations, PostGIS, SQLite, Sanity CMS, multi-tenant architecture</w:t>
+        <w:t xml:space="preserve">PostgreSQL, Supabase, SQL schema design and migrations, PostGIS, geospatial and ETL pipelines at multi-million-record scale, SQLite, Sanity CMS, multi-tenant architecture</w:t>
       </w:r>
     </w:p>
     <w:p>
@@ -456,7 +456,7 @@
           <w:sz w:val="21"/>
           <w:szCs w:val="21"/>
         </w:rPr>
-        <w:t xml:space="preserve">Built ProForge, an AI receptionist that recovers revenue trade businesses lose to unanswered calls. Voice AI answers around the clock, qualifies the caller, books the job into the calendar, sends SMS confirmation, follows up quotes and escalates genuine emergencies to the operator. Twilio carries the numbers and telephony, Vapi handles the speech layer. Sole developer across voice, automation, backend, marketing site and a separate operator dashboard with its own billing and provisioning.</w:t>
+        <w:t xml:space="preserve">Built PropInfo's data layer for an investor-focused direction of the product: a Python ETL pipeline into PostGIS loading 5.88 million records. 5.1 million geocoded G-NAF addresses, 239,895 NSW property sales, 447,794 VIC crime records, 63,673 Census 2021 records by postcode, postal boundaries for map overlays, and RBA cash rate history feeding the investment calculator.</w:t>
       </w:r>
     </w:p>
     <w:p>
@@ -475,7 +475,7 @@
           <w:sz w:val="21"/>
           <w:szCs w:val="21"/>
         </w:rPr>
-        <w:t xml:space="preserve">Built iventicks, an event ticketing platform, across 95 server-side API endpoints: authentication and sessions, guest account claiming, role-based admin, payments, refunds, fraud detection on purchase patterns, bulk event cancellation returning money to hundreds of holders at once, organiser payouts, analytics, data export, and a live check-in stream with offline sync.</w:t>
+        <w:t xml:space="preserve">Built ProForge, an AI receptionist that recovers revenue trade businesses lose to unanswered calls. Voice AI answers around the clock, qualifies the caller, books the job into the calendar, sends SMS confirmation, follows up quotes and escalates genuine emergencies to the operator. Twilio carries the numbers and telephony, Vapi handles the speech layer. Sole developer across voice, automation, backend, marketing site and a separate operator dashboard with its own billing and provisioning.</w:t>
       </w:r>
     </w:p>
     <w:p>
@@ -494,7 +494,7 @@
           <w:sz w:val="21"/>
           <w:szCs w:val="21"/>
         </w:rPr>
-        <w:t xml:space="preserve">Wrote standalone Python tooling for data processing and third-party API clients, including a lead pipeline on httpx and openpyxl, and a headless accessibility scanner on Playwright.</w:t>
+        <w:t xml:space="preserve">Built iventicks, an event ticketing platform, across 95 server-side API endpoints: authentication and sessions, guest account claiming, role-based admin, payments, refunds, fraud detection on purchase patterns, bulk event cancellation returning money to hundreds of holders at once, organiser payouts, analytics, data export, and a live check-in stream with offline sync.</w:t>
       </w:r>
     </w:p>
     <w:p>
@@ -513,7 +513,7 @@
           <w:sz w:val="21"/>
           <w:szCs w:val="21"/>
         </w:rPr>
-        <w:t xml:space="preserve">Delivered client web platforms end to end, including a six-language law firm site and a CMS-driven sponsorship platform where the client edits every career fact without a developer.</w:t>
+        <w:t xml:space="preserve">Wrote standalone Python tooling for data processing and third-party API clients, including a lead pipeline on httpx and openpyxl, and a headless accessibility scanner on Playwright.</w:t>
       </w:r>
     </w:p>
     <w:p>
@@ -532,6 +532,25 @@
           <w:sz w:val="21"/>
           <w:szCs w:val="21"/>
         </w:rPr>
+        <w:t xml:space="preserve">Delivered client web platforms end to end, including a six-language law firm site and a CMS-driven sponsorship platform where the client edits every career fact without a developer.</w:t>
+      </w:r>
+    </w:p>
+    <w:p>
+      <w:pPr>
+        <w:pStyle w:val="ListParagraph"/>
+        <w:numPr>
+          <w:ilvl w:val="0"/>
+          <w:numId w:val="1"/>
+        </w:numPr>
+        <w:spacing w:after="60" w:before="0"/>
+      </w:pPr>
+      <w:r>
+        <w:rPr>
+          <w:rFonts w:ascii="Calibri" w:cs="Calibri" w:eastAsia="Calibri" w:hAnsi="Calibri"/>
+          <w:color w:val="1A1A1A"/>
+          <w:sz w:val="21"/>
+          <w:szCs w:val="21"/>
+        </w:rPr>
         <w:t xml:space="preserve">Engineered a six-scene scroll-scrubbed film homepage with frame-locked scene transitions, separate mobile encodes and server-rendered markup, so all content is present before JavaScript executes.</w:t>
       </w:r>
     </w:p>
@@ -767,7 +786,7 @@
         </w:rPr>
         <w:t xml:space="preserve">PropInfo </w:t>
       </w:r>
-      <w:hyperlink w:history="1" r:id="rIdsbbsg_jqdzvmxzbj-n19n">
+      <w:hyperlink w:history="1" r:id="rIdpwjcadywy_osuutvsuq7w">
         <w:r>
           <w:rPr>
             <w:rFonts w:ascii="Calibri" w:cs="Calibri" w:eastAsia="Calibri" w:hAnsi="Calibri"/>
@@ -786,7 +805,7 @@
           <w:sz w:val="21"/>
           <w:szCs w:val="21"/>
         </w:rPr>
-        <w:t xml:space="preserve"> – Multi-tenant SaaS for Australian buyer's agents. Claude API property assessments reconciled against deterministic financial modelling, CRM, RBAC. Next.js, TypeScript, Supabase, Postgres.</w:t>
+        <w:t xml:space="preserve"> – Multi-tenant SaaS for Australian buyer's agents. Claude API property assessments reconciled against deterministic financial modelling, CRM, RBAC, and a PostGIS data layer of 5.88M records loaded by a Python ETL pipeline. Next.js, TypeScript, Supabase, Postgres, PostGIS.</w:t>
       </w:r>
     </w:p>
     <w:p>
@@ -804,7 +823,7 @@
         </w:rPr>
         <w:t xml:space="preserve">ProForge </w:t>
       </w:r>
-      <w:hyperlink w:history="1" r:id="rIdla8a5mbgn89gmgztoayko">
+      <w:hyperlink w:history="1" r:id="rIddtsb3teizmsaix4seomr4">
         <w:r>
           <w:rPr>
             <w:rFonts w:ascii="Calibri" w:cs="Calibri" w:eastAsia="Calibri" w:hAnsi="Calibri"/>
@@ -841,7 +860,7 @@
         </w:rPr>
         <w:t xml:space="preserve">iventicks </w:t>
       </w:r>
-      <w:hyperlink w:history="1" r:id="rId6ehrsdpiuzufg3kei9q-l">
+      <w:hyperlink w:history="1" r:id="rId4apo73egoqayhe8vnckm9">
         <w:r>
           <w:rPr>
             <w:rFonts w:ascii="Calibri" w:cs="Calibri" w:eastAsia="Calibri" w:hAnsi="Calibri"/>
@@ -878,7 +897,7 @@
         </w:rPr>
         <w:t xml:space="preserve">Strategic Buys </w:t>
       </w:r>
-      <w:hyperlink w:history="1" r:id="rId1rdnfj_gox1ylyo7_bqb5">
+      <w:hyperlink w:history="1" r:id="rIdwgus99agbt367zya0huft">
         <w:r>
           <w:rPr>
             <w:rFonts w:ascii="Calibri" w:cs="Calibri" w:eastAsia="Calibri" w:hAnsi="Calibri"/>
@@ -915,7 +934,7 @@
         </w:rPr>
         <w:t xml:space="preserve">Asprey Lawyers </w:t>
       </w:r>
-      <w:hyperlink w:history="1" r:id="rIdher9-sg10nqakhohd2re8">
+      <w:hyperlink w:history="1" r:id="rIdpdgctms7wa69yaw0yt4rj">
         <w:r>
           <w:rPr>
             <w:rFonts w:ascii="Calibri" w:cs="Calibri" w:eastAsia="Calibri" w:hAnsi="Calibri"/>
@@ -952,7 +971,7 @@
         </w:rPr>
         <w:t xml:space="preserve">Nikunj </w:t>
       </w:r>
-      <w:hyperlink w:history="1" r:id="rId3dfjd4papn5y0ux8qtthg">
+      <w:hyperlink w:history="1" r:id="rIdo5eqgab5_5ppibuorvbe7">
         <w:r>
           <w:rPr>
             <w:rFonts w:ascii="Calibri" w:cs="Calibri" w:eastAsia="Calibri" w:hAnsi="Calibri"/>
@@ -989,7 +1008,7 @@
         </w:rPr>
         <w:t xml:space="preserve">NVRGVP </w:t>
       </w:r>
-      <w:hyperlink w:history="1" r:id="rIdbjp5vnw48jizqlowb4iq5">
+      <w:hyperlink w:history="1" r:id="rId5agexm8-dtreqbfksw14j">
         <w:r>
           <w:rPr>
             <w:rFonts w:ascii="Calibri" w:cs="Calibri" w:eastAsia="Calibri" w:hAnsi="Calibri"/>
@@ -1059,6 +1078,31 @@
           <w:szCs w:val="21"/>
         </w:rPr>
         <w:t xml:space="preserve">– Headless WCAG 2.1 and 2.2 AA scanner on Playwright and axe-core. Dated, hash-verified evidence records, overlay vendor fingerprinting by script signature, and a re-scan with the overlay blocked to report the delta.</w:t>
+      </w:r>
+    </w:p>
+    <w:p>
+      <w:pPr>
+        <w:spacing w:after="80" w:before="0"/>
+      </w:pPr>
+      <w:r>
+        <w:rPr>
+          <w:rFonts w:ascii="Calibri" w:cs="Calibri" w:eastAsia="Calibri" w:hAnsi="Calibri"/>
+          <w:b/>
+          <w:bCs/>
+          <w:color w:val="1A1A1A"/>
+          <w:sz w:val="21"/>
+          <w:szCs w:val="21"/>
+        </w:rPr>
+        <w:t xml:space="preserve">JARVIS </w:t>
+      </w:r>
+      <w:r>
+        <w:rPr>
+          <w:rFonts w:ascii="Calibri" w:cs="Calibri" w:eastAsia="Calibri" w:hAnsi="Calibri"/>
+          <w:color w:val="1A1A1A"/>
+          <w:sz w:val="21"/>
+          <w:szCs w:val="21"/>
+        </w:rPr>
+        <w:t xml:space="preserve">– A local-first AI operating layer for Windows, in development. Tauri 2 in Rust owns the window, tray, global hotkey and sidecar lifecycle; a Node sidecar runs the Claude Agent SDK with tools into the real OS; memory persists in SQLite with FTS5 and mirrors one-way to a markdown vault. Every run carries a hard cost ceiling. A milestone counts as done when it survives a week of daily use, not when the code merges.</w:t>
       </w:r>
     </w:p>
     <w:p>

</xml_diff>